<commit_message>
Complete the letters: phone numbers and preferred contact address
Adds both applicants' telephone numbers, each on their own line of the
letterhead, and switches the contact and delivery address to the personal
address the applicant gave for this purpose, replacing the work address
that had been used as a placeholder. No placeholders remain in any file.

Co-Authored-By: Claude Opus 5 <noreply@anthropic.com>
Claude-Session: https://claude.ai/code/session_01JTVFEqJwwinoqSCBz3SvyV
</commit_message>
<xml_diff>
--- a/blagaj-footage-request/Antraege-DE-Referenzuebersetzung.docx
+++ b/blagaj-footage-request/Antraege-DE-Referenzuebersetzung.docx
@@ -38,7 +38,7 @@
           <w:sz w:val="22"/>
           <w:szCs w:val="22"/>
         </w:rPr>
-        <w:t xml:space="preserve">, Ringstraße 133, 48165 Münster, Deutschland</w:t>
+        <w:t xml:space="preserve">, Ringstraße 133, 48165 Münster, Deutschland · Tel. +49 152 53489673</w:t>
       </w:r>
     </w:p>
     <w:p>
@@ -61,7 +61,7 @@
           <w:sz w:val="22"/>
           <w:szCs w:val="22"/>
         </w:rPr>
-        <w:t xml:space="preserve">, Ringstraße 133, 48165 Münster, Deutschland</w:t>
+        <w:t xml:space="preserve">, Ringstraße 133, 48165 Münster, Deutschland · Tel. +49 152 04465089</w:t>
       </w:r>
     </w:p>
     <w:p>
@@ -74,7 +74,7 @@
           <w:sz w:val="22"/>
           <w:szCs w:val="22"/>
         </w:rPr>
-        <w:t xml:space="preserve">E-Mail: niklas@zauberzeug.com · Telefon: [Telefon]</w:t>
+        <w:t xml:space="preserve">E-Mail: NiklasNeugebauer@outlook.com</w:t>
       </w:r>
     </w:p>
     <w:p>
@@ -528,7 +528,7 @@
           <w:sz w:val="22"/>
           <w:szCs w:val="22"/>
         </w:rPr>
-        <w:t xml:space="preserve">, Ringstraße 133, 48165 Münster, Deutschland</w:t>
+        <w:t xml:space="preserve">, Ringstraße 133, 48165 Münster, Deutschland · Tel. +49 152 53489673</w:t>
       </w:r>
     </w:p>
     <w:p>
@@ -551,7 +551,7 @@
           <w:sz w:val="22"/>
           <w:szCs w:val="22"/>
         </w:rPr>
-        <w:t xml:space="preserve">, Ringstraße 133, 48165 Münster, Deutschland</w:t>
+        <w:t xml:space="preserve">, Ringstraße 133, 48165 Münster, Deutschland · Tel. +49 152 04465089</w:t>
       </w:r>
     </w:p>
     <w:p>
@@ -564,7 +564,7 @@
           <w:sz w:val="22"/>
           <w:szCs w:val="22"/>
         </w:rPr>
-        <w:t xml:space="preserve">E-Mail: niklas@zauberzeug.com · Telefon: [Telefon]</w:t>
+        <w:t xml:space="preserve">E-Mail: NiklasNeugebauer@outlook.com</w:t>
       </w:r>
     </w:p>
     <w:p>
@@ -1332,7 +1332,7 @@
           <w:sz w:val="22"/>
           <w:szCs w:val="22"/>
         </w:rPr>
-        <w:t xml:space="preserve">, Ringstraße 133, 48165 Münster, Deutschland</w:t>
+        <w:t xml:space="preserve">, Ringstraße 133, 48165 Münster, Deutschland · Tel. +49 152 53489673</w:t>
       </w:r>
     </w:p>
     <w:p>
@@ -1355,7 +1355,7 @@
           <w:sz w:val="22"/>
           <w:szCs w:val="22"/>
         </w:rPr>
-        <w:t xml:space="preserve">, Ringstraße 133, 48165 Münster, Deutschland</w:t>
+        <w:t xml:space="preserve">, Ringstraße 133, 48165 Münster, Deutschland · Tel. +49 152 04465089</w:t>
       </w:r>
     </w:p>
     <w:p>
@@ -1368,7 +1368,7 @@
           <w:sz w:val="22"/>
           <w:szCs w:val="22"/>
         </w:rPr>
-        <w:t xml:space="preserve">E-Mail: niklas@zauberzeug.com · Telefon: [Telefon]</w:t>
+        <w:t xml:space="preserve">E-Mail: NiklasNeugebauer@outlook.com</w:t>
       </w:r>
     </w:p>
     <w:p>
@@ -2202,7 +2202,7 @@
           <w:sz w:val="22"/>
           <w:szCs w:val="22"/>
         </w:rPr>
-        <w:t xml:space="preserve">, Ringstraße 133, 48165 Münster, Deutschland</w:t>
+        <w:t xml:space="preserve">, Ringstraße 133, 48165 Münster, Deutschland · Tel. +49 152 53489673</w:t>
       </w:r>
     </w:p>
     <w:p>
@@ -2225,7 +2225,7 @@
           <w:sz w:val="22"/>
           <w:szCs w:val="22"/>
         </w:rPr>
-        <w:t xml:space="preserve">, Ringstraße 133, 48165 Münster, Deutschland</w:t>
+        <w:t xml:space="preserve">, Ringstraße 133, 48165 Münster, Deutschland · Tel. +49 152 04465089</w:t>
       </w:r>
     </w:p>
     <w:p>
@@ -2238,7 +2238,7 @@
           <w:sz w:val="22"/>
           <w:szCs w:val="22"/>
         </w:rPr>
-        <w:t xml:space="preserve">E-Mail: niklas@zauberzeug.com · Telefon: [Telefon]</w:t>
+        <w:t xml:space="preserve">E-Mail: NiklasNeugebauer@outlook.com</w:t>
       </w:r>
     </w:p>
     <w:p>
@@ -2866,7 +2866,7 @@
           <w:sz w:val="22"/>
           <w:szCs w:val="22"/>
         </w:rPr>
-        <w:t xml:space="preserve"> Wir bitten um Übermittlung in einem gängigen elektronischen Format an die E-Mail-Adresse niklas@zauberzeug.com bzw. auf einem Datenträger, den wir persönlich abholen können. Sofern die Aufnahme aus einem System exportiert wird, das ein eigenes Aufzeichnungsformat verwendet, bitten wir um Übermittlung im Format </w:t>
+        <w:t xml:space="preserve"> Wir bitten um Übermittlung in einem gängigen elektronischen Format an die E-Mail-Adresse NiklasNeugebauer@outlook.com bzw. auf einem Datenträger, den wir persönlich abholen können. Sofern die Aufnahme aus einem System exportiert wird, das ein eigenes Aufzeichnungsformat verwendet, bitten wir um Übermittlung im Format </w:t>
       </w:r>
       <w:r>
         <w:rPr>

</xml_diff>

<commit_message>
Add PDFs of both versions, generated from the same source
LibreOffice cannot open any document in this container, so the PDFs are
rendered directly from the shared letter content with a PDF library, using
Liberation Serif - metrically compatible with Times New Roman and covering
both the Bosnian diacritics and the German umlauts.

Every page was rasterised and inspected. Two layout fixes came out of that:
the signature block was stranded alone on an otherwise empty page, so the
final paragraph of each letter is now measured and kept together with the
closing, and the covering letter fits on a single page; and the closing
quotation marks are now typographically correct, which matters because they
appear in the addressee's own name on every page.

All three formats were cross-checked against each other for the applicants'
details and for stale placeholders.

Co-Authored-By: Claude Opus 5 <noreply@anthropic.com>
Claude-Session: https://claude.ai/code/session_01JTVFEqJwwinoqSCBz3SvyV
</commit_message>
<xml_diff>
--- a/blagaj-footage-request/Antraege-DE-Referenzuebersetzung.docx
+++ b/blagaj-footage-request/Antraege-DE-Referenzuebersetzung.docx
@@ -89,7 +89,7 @@
           <w:sz w:val="22"/>
           <w:szCs w:val="22"/>
         </w:rPr>
-        <w:t xml:space="preserve">Agencija „Stari grad" Mostar</w:t>
+        <w:t xml:space="preserve">Agencija „Stari grad“ Mostar</w:t>
       </w:r>
     </w:p>
     <w:p>
@@ -258,7 +258,7 @@
           <w:sz w:val="22"/>
           <w:szCs w:val="22"/>
         </w:rPr>
-        <w:t xml:space="preserve"> — Art. 20 des Gesetzes über den Schutz personenbezogener Daten („Amtsblatt BiH" Nr. 12/25).</w:t>
+        <w:t xml:space="preserve"> — Art. 20 des Gesetzes über den Schutz personenbezogener Daten („Amtsblatt BiH“ Nr. 12/25).</w:t>
       </w:r>
     </w:p>
     <w:p>
@@ -282,7 +282,7 @@
           <w:sz w:val="22"/>
           <w:szCs w:val="22"/>
         </w:rPr>
-        <w:t xml:space="preserve"> — Gesetz über die Freiheit des Zugangs zu Informationen in der Föderation BiH („Amtsblatt der FBiH" Nr. 32/01 und 48/11).</w:t>
+        <w:t xml:space="preserve"> — Gesetz über die Freiheit des Zugangs zu Informationen in der Föderation BiH („Amtsblatt der FBiH“ Nr. 32/01 und 48/11).</w:t>
       </w:r>
     </w:p>
     <w:p>
@@ -306,7 +306,7 @@
           <w:sz w:val="22"/>
           <w:szCs w:val="22"/>
         </w:rPr>
-        <w:t xml:space="preserve"> — Art. 17 des Gesetzes über den Schutz personenbezogener Daten („Amtsblatt BiH" Nr. 12/25).</w:t>
+        <w:t xml:space="preserve"> — Art. 17 des Gesetzes über den Schutz personenbezogener Daten („Amtsblatt BiH“ Nr. 12/25).</w:t>
       </w:r>
     </w:p>
     <w:p>
@@ -579,7 +579,7 @@
           <w:sz w:val="22"/>
           <w:szCs w:val="22"/>
         </w:rPr>
-        <w:t xml:space="preserve">Agencija „Stari grad" Mostar</w:t>
+        <w:t xml:space="preserve">Agencija „Stari grad“ Mostar</w:t>
       </w:r>
     </w:p>
     <w:p>
@@ -685,7 +685,7 @@
           <w:sz w:val="22"/>
           <w:szCs w:val="22"/>
         </w:rPr>
-        <w:t xml:space="preserve">Gestützt auf Art. 14 Abs. 2 des Gesetzes über den Schutz personenbezogener Daten („Amtsblatt BiH" Nr. 12/25) (im Folgenden: das Gesetz), wonach der Verantwortliche der betroffenen Person die Ausübung ihrer Rechte nach Art. 17 bis 24 des Gesetzes erleichtert, stellen wir den </w:t>
+        <w:t xml:space="preserve">Gestützt auf Art. 14 Abs. 2 des Gesetzes über den Schutz personenbezogener Daten („Amtsblatt BiH“ Nr. 12/25) (im Folgenden: das Gesetz), wonach der Verantwortliche der betroffenen Person die Ausübung ihrer Rechte nach Art. 17 bis 24 des Gesetzes erleichtert, stellen wir den </w:t>
       </w:r>
       <w:r>
         <w:rPr>
@@ -1383,7 +1383,7 @@
           <w:sz w:val="22"/>
           <w:szCs w:val="22"/>
         </w:rPr>
-        <w:t xml:space="preserve">Agencija „Stari grad" Mostar</w:t>
+        <w:t xml:space="preserve">Agencija „Stari grad“ Mostar</w:t>
       </w:r>
     </w:p>
     <w:p>
@@ -1450,7 +1450,7 @@
           <w:sz w:val="22"/>
           <w:szCs w:val="22"/>
         </w:rPr>
-        <w:t xml:space="preserve">BETREFF: ANTRAG AUF INFORMATIONSZUGANG — Art. 4, 11 und 14 des Gesetzes über die Freiheit des Zugangs zu Informationen in der Föderation Bosnien und Herzegowina („Amtsblatt der Föderation BiH" Nr. 32/01 und 48/11)</w:t>
+        <w:t xml:space="preserve">BETREFF: ANTRAG AUF INFORMATIONSZUGANG — Art. 4, 11 und 14 des Gesetzes über die Freiheit des Zugangs zu Informationen in der Föderation Bosnien und Herzegowina („Amtsblatt der Föderation BiH“ Nr. 32/01 und 48/11)</w:t>
       </w:r>
     </w:p>
     <w:p>
@@ -1504,7 +1504,7 @@
           <w:sz w:val="22"/>
           <w:szCs w:val="22"/>
         </w:rPr>
-        <w:t xml:space="preserve">Gestützt auf Art. 4 und Art. 11 des Gesetzes über die Freiheit des Zugangs zu Informationen in der Föderation Bosnien und Herzegowina („Amtsblatt der Föderation BiH" Nr. 32/01 und 48/11) (im Folgenden: ZoSPI FBiH) beantragen wir Zugang zu den folgenden, in der Verfügungsgewalt Ihrer Behörde stehenden Informationen:</w:t>
+        <w:t xml:space="preserve">Gestützt auf Art. 4 und Art. 11 des Gesetzes über die Freiheit des Zugangs zu Informationen in der Föderation Bosnien und Herzegowina („Amtsblatt der Föderation BiH“ Nr. 32/01 und 48/11) (im Folgenden: ZoSPI FBiH) beantragen wir Zugang zu den folgenden, in der Verfügungsgewalt Ihrer Behörde stehenden Informationen:</w:t>
       </w:r>
     </w:p>
     <w:p>
@@ -1717,7 +1717,7 @@
           <w:sz w:val="22"/>
           <w:szCs w:val="22"/>
         </w:rPr>
-        <w:t xml:space="preserve">"), womit eine Videoaufzeichnung erfasst ist.</w:t>
+        <w:t xml:space="preserve">“), womit eine Videoaufzeichnung erfasst ist.</w:t>
       </w:r>
     </w:p>
     <w:p>
@@ -1864,7 +1864,7 @@
           <w:sz w:val="22"/>
           <w:szCs w:val="22"/>
         </w:rPr>
-        <w:t xml:space="preserve">Wir weisen ferner darauf hin, dass nach Art. 53 Abs. 2 des Gesetzes über den Schutz personenbezogener Daten („Amtsblatt BiH" Nr. 12/25) dieses Gesetz auch bei der Anwendung der Vorschriften über die Freiheit des Zugangs zu Informationen in Bosnien und Herzegowina Anwendung findet.</w:t>
+        <w:t xml:space="preserve">Wir weisen ferner darauf hin, dass nach Art. 53 Abs. 2 des Gesetzes über den Schutz personenbezogener Daten („Amtsblatt BiH“ Nr. 12/25) dieses Gesetz auch bei der Anwendung der Vorschriften über die Freiheit des Zugangs zu Informationen in Bosnien und Herzegowina Anwendung findet.</w:t>
       </w:r>
     </w:p>
     <w:p>
@@ -2253,7 +2253,7 @@
           <w:sz w:val="22"/>
           <w:szCs w:val="22"/>
         </w:rPr>
-        <w:t xml:space="preserve">Agencija „Stari grad" Mostar</w:t>
+        <w:t xml:space="preserve">Agencija „Stari grad“ Mostar</w:t>
       </w:r>
     </w:p>
     <w:p>
@@ -2320,7 +2320,7 @@
           <w:sz w:val="22"/>
           <w:szCs w:val="22"/>
         </w:rPr>
-        <w:t xml:space="preserve">BETREFF: ANTRAG AUF AUSKUNFT ÜBER PERSONENBEZOGENE DATEN UND AUF ÜBERLASSUNG EINER KOPIE — Art. 17 des Gesetzes über den Schutz personenbezogener Daten („Amtsblatt BiH" Nr. 12/25)</w:t>
+        <w:t xml:space="preserve">BETREFF: ANTRAG AUF AUSKUNFT ÜBER PERSONENBEZOGENE DATEN UND AUF ÜBERLASSUNG EINER KOPIE — Art. 17 des Gesetzes über den Schutz personenbezogener Daten („Amtsblatt BiH“ Nr. 12/25)</w:t>
       </w:r>
     </w:p>
     <w:p>
@@ -2377,7 +2377,7 @@
           <w:sz w:val="22"/>
           <w:szCs w:val="22"/>
         </w:rPr>
-        <w:t xml:space="preserve"> des Gesetzes über den Schutz personenbezogener Daten („Amtsblatt BiH" Nr. 12/25) (im Folgenden: das Gesetz) beantragen wir als betroffene Personen, uns Auskunft über unsere mittels Videoüberwachung verarbeiteten personenbezogenen Daten zu erteilen und uns </w:t>
+        <w:t xml:space="preserve"> des Gesetzes über den Schutz personenbezogener Daten („Amtsblatt BiH“ Nr. 12/25) (im Folgenden: das Gesetz) beantragen wir als betroffene Personen, uns Auskunft über unsere mittels Videoüberwachung verarbeiteten personenbezogenen Daten zu erteilen und uns </w:t>
       </w:r>
       <w:r>
         <w:rPr>

</xml_diff>

<commit_message>
Say that the climb up at dawn was deliberate
The letters had the engagement happening early in the morning as if by
chance. It was the reason for the climb, which is a materially better
opening: someone who walked up a hill before seven specifically to propose
reads as a person with a story, not as a member of the public filing a
request. All four letters in both languages now say so, as does the
covering email.

Co-Authored-By: Claude Opus 5 <noreply@anthropic.com>
Claude-Session: https://claude.ai/code/session_01JTVFEqJwwinoqSCBz3SvyV
</commit_message>
<xml_diff>
--- a/blagaj-footage-request/Antraege-DE-Referenzuebersetzung.docx
+++ b/blagaj-footage-request/Antraege-DE-Referenzuebersetzung.docx
@@ -182,7 +182,7 @@
           <w:sz w:val="22"/>
           <w:szCs w:val="22"/>
         </w:rPr>
-        <w:t xml:space="preserve">am 9. September 2026 haben wir uns in den frühen Morgenstunden auf der Burg Stari grad Blagaj verlobt. Es war gegen 7 Uhr morgens, und außer uns befanden sich zu diesem Zeitpunkt keine weiteren Besucher auf dem Gelände.</w:t>
+        <w:t xml:space="preserve">am 9. September 2026 sind wir früh am Morgen zur Burg Stari grad Blagaj hinaufgestiegen — eigens zu dem Zweck, uns dort zu verloben. Es war gegen 7 Uhr morgens; außer uns befanden sich zu diesem Zeitpunkt keine weiteren Besucher auf dem Gelände.</w:t>
       </w:r>
     </w:p>
     <w:p>
@@ -672,7 +672,7 @@
           <w:sz w:val="22"/>
           <w:szCs w:val="22"/>
         </w:rPr>
-        <w:t xml:space="preserve">am 9. September 2026 haben wir uns gegen 7 Uhr morgens auf der Burg Stari grad Blagaj verlobt. Unsere eigene Kamera versagte, sodass wir kein einziges Foto von diesem Moment besitzen. Die Videoüberwachungsaufnahme jenes Morgens ist die einzige Aufzeichnung, die möglicherweise existiert — deshalb wenden wir uns an Sie.</w:t>
+        <w:t xml:space="preserve">am 9. September 2026 sind wir früh am Morgen zur Burg Stari grad Blagaj hinaufgestiegen — eigens zu dem Zweck, uns dort zu verloben. Es war gegen 7 Uhr. Unsere eigene Kamera versagte, sodass wir kein einziges Foto von diesem Moment besitzen. Die Videoüberwachungsaufnahme jenes Morgens ist die einzige Aufzeichnung, die möglicherweise existiert — deshalb wenden wir uns an Sie.</w:t>
       </w:r>
     </w:p>
     <w:p>
@@ -1491,7 +1491,7 @@
           <w:sz w:val="22"/>
           <w:szCs w:val="22"/>
         </w:rPr>
-        <w:t xml:space="preserve">am 9. September 2026 haben wir uns gegen 7 Uhr morgens auf der Burg Stari grad Blagaj verlobt; unsere eigene Kamera versagte. Wir bitten um die Videoüberwachungsaufnahme jenes Morgens, da sie die einzige möglicherweise existierende Aufzeichnung dieses Moments ist.</w:t>
+        <w:t xml:space="preserve">am 9. September 2026 sind wir früh am Morgen zur Burg Stari grad Blagaj hinaufgestiegen — eigens zu dem Zweck, uns dort zu verloben; dabei versagte unsere eigene Kamera. Wir bitten um die Videoüberwachungsaufnahme jenes Morgens, da sie die einzige möglicherweise existierende Aufzeichnung dieses Moments ist.</w:t>
       </w:r>
     </w:p>
     <w:p>
@@ -2346,7 +2346,7 @@
           <w:sz w:val="22"/>
           <w:szCs w:val="22"/>
         </w:rPr>
-        <w:t xml:space="preserve">am 9. September 2026 haben wir uns gegen 7 Uhr morgens auf der Burg Stari grad Blagaj verlobt. Unsere eigene Kamera versagte, und wir besitzen kein einziges Foto von diesem Moment; die Videoüberwachungsaufnahme ist die einzige Aufzeichnung, die möglicherweise existiert.</w:t>
+        <w:t xml:space="preserve">am 9. September 2026 sind wir früh am Morgen zur Burg Stari grad Blagaj hinaufgestiegen — eigens zu dem Zweck, uns dort zu verloben. Unsere eigene Kamera versagte, und wir besitzen kein einziges Foto von diesem Moment; die Videoüberwachungsaufnahme ist die einzige Aufzeichnung, die möglicherweise existiert.</w:t>
       </w:r>
     </w:p>
     <w:p>

</xml_diff>